<commit_message>
agents command: known agents, open offers, timed runs, agents by level, standings
Co-Authored-By: Claude Sonnet 5.5 <noreply@anthropic.com>
Claude-Session: https://claude.ai/code/session_01FpAeMd8RZSyQpWh3R9Tigo
</commit_message>
<xml_diff>
--- a/md/COMMANDS.docx
+++ b/md/COMMANDS.docx
@@ -1179,6 +1179,24 @@
     </w:p>
     <w:p>
       <w:r>
+        <w:rPr>
+          <w:b/>
+        </w:rPr>
+        <w:t xml:space="preserve">AGENTS  -  agents we know: open offers, your runs with them, agents near you by level, standings</w:t>
+      </w:r>
+    </w:p>
+    <w:p>
+      <w:r>
+        <w:t xml:space="preserve">   example: python -m eve_profit agents</w:t>
+      </w:r>
+    </w:p>
+    <w:p>
+      <w:r>
+        <w:t xml:space="preserve"/>
+      </w:r>
+    </w:p>
+    <w:p>
+      <w:r>
         <w:t xml:space="preserve">Scripts: python scripts/agent_steps.py [next|list|done|skip|back|reset]  - Level 1 agent checklist.</w:t>
       </w:r>
     </w:p>

</xml_diff>

<commit_message>
fixlast --activity: correct an older timed run
Co-Authored-By: Claude Sonnet 5.5 <noreply@anthropic.com>
Claude-Session: https://claude.ai/code/session_01FpAeMd8RZSyQpWh3R9Tigo
</commit_message>
<xml_diff>
--- a/md/COMMANDS.docx
+++ b/md/COMMANDS.docx
@@ -1169,7 +1169,12 @@
     </w:p>
     <w:p>
       <w:r>
-        <w:t xml:space="preserve">   example: python -m eve_profit fixlast --add-min 5</w:t>
+        <w:t xml:space="preserve">   --activity     name of the activity (use the same name each time)</w:t>
+      </w:r>
+    </w:p>
+    <w:p>
+      <w:r>
+        <w:t xml:space="preserve">   example: python -m eve_profit fixlast --activity "step 2 Soldier" --isk 180000</w:t>
       </w:r>
     </w:p>
     <w:p>

</xml_diff>

<commit_message>
buy command: cheapest places to BUY an item near you
Co-Authored-By: Claude Sonnet 5.5 <noreply@anthropic.com>
Claude-Session: https://claude.ai/code/session_01FpAeMd8RZSyQpWh3R9Tigo
</commit_message>
<xml_diff>
--- a/md/COMMANDS.docx
+++ b/md/COMMANDS.docx
@@ -1202,6 +1202,39 @@
     </w:p>
     <w:p>
       <w:r>
+        <w:rPr>
+          <w:b/>
+        </w:rPr>
+        <w:t xml:space="preserve">BUY  -  where to BUY an item cheapest near you (for agent jobs: acquire these goods)</w:t>
+      </w:r>
+    </w:p>
+    <w:p>
+      <w:r>
+        <w:t xml:space="preserve">   --item         bestprice: item name or type id</w:t>
+      </w:r>
+    </w:p>
+    <w:p>
+      <w:r>
+        <w:t xml:space="preserve">   --qty          bestprice: quantity (default: what you hold here, else 1)</w:t>
+      </w:r>
+    </w:p>
+    <w:p>
+      <w:r>
+        <w:t xml:space="preserve">   --radius       buy: how many jumps around you to look for sellers</w:t>
+      </w:r>
+    </w:p>
+    <w:p>
+      <w:r>
+        <w:t xml:space="preserve">   example: python -m eve_profit buy --item "Cap Booster 25" --qty 20</w:t>
+      </w:r>
+    </w:p>
+    <w:p>
+      <w:r>
+        <w:t xml:space="preserve"/>
+      </w:r>
+    </w:p>
+    <w:p>
+      <w:r>
         <w:t xml:space="preserve">Scripts: python scripts/agent_steps.py [next|list|done|skip|back|reset]  - Level 1 agent checklist.</w:t>
       </w:r>
     </w:p>

</xml_diff>

<commit_message>
Agent offers: travel to the agent first (no remote accept); fixlast --delete
Co-Authored-By: Claude Sonnet 5.5 <noreply@anthropic.com>
Claude-Session: https://claude.ai/code/session_01FpAeMd8RZSyQpWh3R9Tigo
</commit_message>
<xml_diff>
--- a/md/COMMANDS.docx
+++ b/md/COMMANDS.docx
@@ -1174,6 +1174,11 @@
     </w:p>
     <w:p>
       <w:r>
+        <w:t xml:space="preserve">   --delete       fixlast: delete that timed run (e.g. a timer started by mistake)</w:t>
+      </w:r>
+    </w:p>
+    <w:p>
+      <w:r>
         <w:t xml:space="preserve">   example: python -m eve_profit fixlast --activity "step 2 Soldier" --isk 180000</w:t>
       </w:r>
     </w:p>

</xml_diff>

<commit_message>
next: ONE step only (KISS); --all for the long view
Co-Authored-By: Claude Sonnet 5.5 <noreply@anthropic.com>
Claude-Session: https://claude.ai/code/session_01FpAeMd8RZSyQpWh3R9Tigo
</commit_message>
<xml_diff>
--- a/md/COMMANDS.docx
+++ b/md/COMMANDS.docx
@@ -644,6 +644,11 @@
     </w:p>
     <w:p>
       <w:r>
+        <w:t xml:space="preserve">   --all          next: print everything (offers, skills, trades), not just the one step</w:t>
+      </w:r>
+    </w:p>
+    <w:p>
+      <w:r>
         <w:t xml:space="preserve">   example: python -m eve_profit next</w:t>
       </w:r>
     </w:p>

</xml_diff>

<commit_message>
start/stop show clock times; stop --minutes; Arnelin step 10 Navitas
Co-Authored-By: Claude Sonnet 5.5 <noreply@anthropic.com>
Claude-Session: https://claude.ai/code/session_01FpAeMd8RZSyQpWh3R9Tigo
</commit_message>
<xml_diff>
--- a/md/COMMANDS.docx
+++ b/md/COMMANDS.docx
@@ -1013,6 +1013,11 @@
     </w:p>
     <w:p>
       <w:r>
+        <w:t xml:space="preserve">   --minutes      stop: minutes you really worked (use after falling asleep or leaving); replaces the clock time</w:t>
+      </w:r>
+    </w:p>
+    <w:p>
+      <w:r>
         <w:t xml:space="preserve">   --add-min      stop/fixlast: minutes of work to ADD (e.g. worked while the timer was paused)</w:t>
       </w:r>
     </w:p>

</xml_diff>

<commit_message>
careers command: ISK/hr per career, what to try next
Co-Authored-By: Claude Sonnet 5.5 <noreply@anthropic.com>
Claude-Session: https://claude.ai/code/session_01FpAeMd8RZSyQpWh3R9Tigo
</commit_message>
<xml_diff>
--- a/md/COMMANDS.docx
+++ b/md/COMMANDS.docx
@@ -1250,6 +1250,24 @@
     </w:p>
     <w:p>
       <w:r>
+        <w:rPr>
+          <w:b/>
+        </w:rPr>
+        <w:t xml:space="preserve">CAREERS  -  ISK/hr per career path from your timed runs; which to try next</w:t>
+      </w:r>
+    </w:p>
+    <w:p>
+      <w:r>
+        <w:t xml:space="preserve">   example: python -m eve_profit careers</w:t>
+      </w:r>
+    </w:p>
+    <w:p>
+      <w:r>
+        <w:t xml:space="preserve"/>
+      </w:r>
+    </w:p>
+    <w:p>
+      <w:r>
         <w:t xml:space="preserve">Scripts: python scripts/agent_steps.py [next|list|done|skip|back|reset]  - Level 1 agent checklist.</w:t>
       </w:r>
     </w:p>

</xml_diff>

<commit_message>
scan --live: 5 min budget, sell plan refreshed after every live scan
Co-Authored-By: Claude Sonnet 5.5 <noreply@anthropic.com>
Claude-Session: https://claude.ai/code/session_01FpAeMd8RZSyQpWh3R9Tigo
</commit_message>
<xml_diff>
--- a/md/COMMANDS.docx
+++ b/md/COMMANDS.docx
@@ -137,6 +137,11 @@
     </w:p>
     <w:p>
       <w:r>
+        <w:t xml:space="preserve">   --budget       scan --live: stop downloading new regions after this many minutes (default 5; 0 = no limit)</w:t>
+      </w:r>
+    </w:p>
+    <w:p>
+      <w:r>
         <w:t xml:space="preserve">   --live         use real ESI market data</w:t>
       </w:r>
     </w:p>

</xml_diff>

<commit_message>
Model map: activity catalog, models command, model-building turns in next
Co-Authored-By: Claude Sonnet 5.5 <noreply@anthropic.com>
Claude-Session: https://claude.ai/code/session_01FpAeMd8RZSyQpWh3R9Tigo
</commit_message>
<xml_diff>
--- a/md/COMMANDS.docx
+++ b/md/COMMANDS.docx
@@ -1273,6 +1273,24 @@
     </w:p>
     <w:p>
       <w:r>
+        <w:rPr>
+          <w:b/>
+        </w:rPr>
+        <w:t xml:space="preserve">MODELS  -  the map of every activity: modeled, unmodeled, locked</w:t>
+      </w:r>
+    </w:p>
+    <w:p>
+      <w:r>
+        <w:t xml:space="preserve">   example: python -m eve_profit models</w:t>
+      </w:r>
+    </w:p>
+    <w:p>
+      <w:r>
+        <w:t xml:space="preserve"/>
+      </w:r>
+    </w:p>
+    <w:p>
+      <w:r>
         <w:t xml:space="preserve">Scripts: python scripts/agent_steps.py [next|list|done|skip|back|reset]  - Level 1 agent checklist.</w:t>
       </w:r>
     </w:p>

</xml_diff>

<commit_message>
Ships/gear/standings unlocks in the look-ahead planner; next prints one step (--plan to look ahead); history command
Co-Authored-By: Claude Sonnet 5.5 <noreply@anthropic.com>
Claude-Session: https://claude.ai/code/session_01FpAeMd8RZSyQpWh3R9Tigo
</commit_message>
<xml_diff>
--- a/md/COMMANDS.docx
+++ b/md/COMMANDS.docx
@@ -639,7 +639,7 @@
         <w:rPr>
           <w:b/>
         </w:rPr>
-        <w:t xml:space="preserve">NEXT  -  ONE next step (agent offers, sell/list, best trade)</w:t>
+        <w:t xml:space="preserve">NEXT  -  ONE next step; add --plan to look ahead (the chain and the long view)</w:t>
       </w:r>
     </w:p>
     <w:p>
@@ -1282,6 +1282,24 @@
     <w:p>
       <w:r>
         <w:t xml:space="preserve">   example: python -m eve_profit models</w:t>
+      </w:r>
+    </w:p>
+    <w:p>
+      <w:r>
+        <w:t xml:space="preserve"/>
+      </w:r>
+    </w:p>
+    <w:p>
+      <w:r>
+        <w:rPr>
+          <w:b/>
+        </w:rPr>
+        <w:t xml:space="preserve">HISTORY  -  the steps you completed, newest first, with ISK per minute</w:t>
+      </w:r>
+    </w:p>
+    <w:p>
+      <w:r>
+        <w:t xml:space="preserve">   example: python -m eve_profit history --n 20</w:t>
       </w:r>
     </w:p>
     <w:p>

</xml_diff>

<commit_message>
settle: match later sales and fees to the step that listed them, merge the finishing step
Co-Authored-By: Claude Sonnet 5.5 <noreply@anthropic.com>
Claude-Session: https://claude.ai/code/session_01FpAeMd8RZSyQpWh3R9Tigo
</commit_message>
<xml_diff>
--- a/md/COMMANDS.docx
+++ b/md/COMMANDS.docx
@@ -1309,6 +1309,24 @@
     </w:p>
     <w:p>
       <w:r>
+        <w:rPr>
+          <w:b/>
+        </w:rPr>
+        <w:t xml:space="preserve">SETTLE  -  match market sales and fees to the step that listed them (dry run; --apply saves)</w:t>
+      </w:r>
+    </w:p>
+    <w:p>
+      <w:r>
+        <w:t xml:space="preserve">   example: python -m eve_profit settle</w:t>
+      </w:r>
+    </w:p>
+    <w:p>
+      <w:r>
+        <w:t xml:space="preserve"/>
+      </w:r>
+    </w:p>
+    <w:p>
+      <w:r>
         <w:t xml:space="preserve">Scripts: python scripts/agent_steps.py [next|list|done|skip|back|reset]  - Level 1 agent checklist.</w:t>
       </w:r>
     </w:p>

</xml_diff>

<commit_message>
Daily goals chain: one step at a time, detected from sync; done command; timer not offered twice
Co-Authored-By: Claude Sonnet 5.5 <noreply@anthropic.com>
Claude-Session: https://claude.ai/code/session_01FpAeMd8RZSyQpWh3R9Tigo
</commit_message>
<xml_diff>
--- a/md/COMMANDS.docx
+++ b/md/COMMANDS.docx
@@ -1327,6 +1327,24 @@
     </w:p>
     <w:p>
       <w:r>
+        <w:rPr>
+          <w:b/>
+        </w:rPr>
+        <w:t xml:space="preserve">DONE  -  mark the optional step of the daily-goals chain (epic arc) as done or skipped</w:t>
+      </w:r>
+    </w:p>
+    <w:p>
+      <w:r>
+        <w:t xml:space="preserve">   example: python -m eve_profit done</w:t>
+      </w:r>
+    </w:p>
+    <w:p>
+      <w:r>
+        <w:t xml:space="preserve"/>
+      </w:r>
+    </w:p>
+    <w:p>
+      <w:r>
         <w:t xml:space="preserve">Scripts: python scripts/agent_steps.py [next|list|done|skip|back|reset]  - Level 1 agent checklist.</w:t>
       </w:r>
     </w:p>

</xml_diff>

<commit_message>
hours command: timed hours and career points per hour
Co-Authored-By: Claude Sonnet 5.5 <noreply@anthropic.com>
Claude-Session: https://claude.ai/code/session_01FpAeMd8RZSyQpWh3R9Tigo
</commit_message>
<xml_diff>
--- a/md/COMMANDS.docx
+++ b/md/COMMANDS.docx
@@ -1345,6 +1345,24 @@
     </w:p>
     <w:p>
       <w:r>
+        <w:rPr>
+          <w:b/>
+        </w:rPr>
+        <w:t xml:space="preserve">HOURS  -  hours played as far as timed runs show, and career points per hour</w:t>
+      </w:r>
+    </w:p>
+    <w:p>
+      <w:r>
+        <w:t xml:space="preserve">   example: python -m eve_profit hours</w:t>
+      </w:r>
+    </w:p>
+    <w:p>
+      <w:r>
+        <w:t xml:space="preserve"/>
+      </w:r>
+    </w:p>
+    <w:p>
+      <w:r>
         <w:t xml:space="preserve">Scripts: python scripts/agent_steps.py [next|list|done|skip|back|reset]  - Level 1 agent checklist.</w:t>
       </w:r>
     </w:p>

</xml_diff>

<commit_message>
Notifications reader; calmer screens step
Co-Authored-By: Claude Sonnet 5.5 <noreply@anthropic.com>
Claude-Session: https://claude.ai/code/session_01FpAeMd8RZSyQpWh3R9Tigo
</commit_message>
<xml_diff>
--- a/md/COMMANDS.docx
+++ b/md/COMMANDS.docx
@@ -1363,6 +1363,24 @@
     </w:p>
     <w:p>
       <w:r>
+        <w:rPr>
+          <w:b/>
+        </w:rPr>
+        <w:t xml:space="preserve">ALERTS  -  recent game notifications (skill finished, alerts)</w:t>
+      </w:r>
+    </w:p>
+    <w:p>
+      <w:r>
+        <w:t xml:space="preserve">   example: python -m eve_profit alerts --n 10</w:t>
+      </w:r>
+    </w:p>
+    <w:p>
+      <w:r>
+        <w:t xml:space="preserve"/>
+      </w:r>
+    </w:p>
+    <w:p>
+      <w:r>
         <w:t xml:space="preserve">Scripts: python scripts/agent_steps.py [next|list|done|skip|back|reset]  - Level 1 agent checklist.</w:t>
       </w:r>
     </w:p>

</xml_diff>

<commit_message>
esiroutes: find ESI routes for freelance jobs
Co-Authored-By: Claude Sonnet 5.5 <noreply@anthropic.com>
Claude-Session: https://claude.ai/code/session_01FpAeMd8RZSyQpWh3R9Tigo
</commit_message>
<xml_diff>
--- a/md/COMMANDS.docx
+++ b/md/COMMANDS.docx
@@ -1381,6 +1381,24 @@
     </w:p>
     <w:p>
       <w:r>
+        <w:rPr>
+          <w:b/>
+        </w:rPr>
+        <w:t xml:space="preserve">ESIROUTES  -  which ESI routes exist for a word (default: project, freelance, opportunity)</w:t>
+      </w:r>
+    </w:p>
+    <w:p>
+      <w:r>
+        <w:t xml:space="preserve">   example: python -m eve_profit esiroutes --item project,freelance</w:t>
+      </w:r>
+    </w:p>
+    <w:p>
+      <w:r>
+        <w:t xml:space="preserve"/>
+      </w:r>
+    </w:p>
+    <w:p>
+      <w:r>
         <w:t xml:space="preserve">Scripts: python scripts/agent_steps.py [next|list|done|skip|back|reset]  - Level 1 agent checklist.</w:t>
       </w:r>
     </w:p>

</xml_diff>

<commit_message>
freelance: download Freelance Jobs from ESI (public routes found)
Co-Authored-By: Claude Sonnet 5.5 <noreply@anthropic.com>
Claude-Session: https://claude.ai/code/session_01FpAeMd8RZSyQpWh3R9Tigo
</commit_message>
<xml_diff>
--- a/md/COMMANDS.docx
+++ b/md/COMMANDS.docx
@@ -1399,6 +1399,24 @@
     </w:p>
     <w:p>
       <w:r>
+        <w:rPr>
+          <w:b/>
+        </w:rPr>
+        <w:t xml:space="preserve">FREELANCE  -  download all Freelance Jobs from ESI (public, no screenshots)</w:t>
+      </w:r>
+    </w:p>
+    <w:p>
+      <w:r>
+        <w:t xml:space="preserve">   example: python -m eve_profit freelance</w:t>
+      </w:r>
+    </w:p>
+    <w:p>
+      <w:r>
+        <w:t xml:space="preserve"/>
+      </w:r>
+    </w:p>
+    <w:p>
+      <w:r>
         <w:t xml:space="preserve">Scripts: python scripts/agent_steps.py [next|list|done|skip|back|reset]  - Level 1 agent checklist.</w:t>
       </w:r>
     </w:p>

</xml_diff>

<commit_message>
Programmatic data grabs run inside now on their own schedule
Co-Authored-By: Claude Sonnet 5.5 <noreply@anthropic.com>
Claude-Session: https://claude.ai/code/session_01FpAeMd8RZSyQpWh3R9Tigo
</commit_message>
<xml_diff>
--- a/md/COMMANDS.docx
+++ b/md/COMMANDS.docx
@@ -1417,6 +1417,24 @@
     </w:p>
     <w:p>
       <w:r>
+        <w:rPr>
+          <w:b/>
+        </w:rPr>
+        <w:t xml:space="preserve">GRABS  -  run the programmatic data grabs that are due (--all forces them)</w:t>
+      </w:r>
+    </w:p>
+    <w:p>
+      <w:r>
+        <w:t xml:space="preserve">   example: python -m eve_profit grabs --all</w:t>
+      </w:r>
+    </w:p>
+    <w:p>
+      <w:r>
+        <w:t xml:space="preserve"/>
+      </w:r>
+    </w:p>
+    <w:p>
+      <w:r>
         <w:t xml:space="preserve">Scripts: python scripts/agent_steps.py [next|list|done|skip|back|reset]  - Level 1 agent checklist.</w:t>
       </w:r>
     </w:p>

</xml_diff>

<commit_message>
Freelance: parse methods, alive filter, details batch, nearby jobs command
Co-Authored-By: Claude Sonnet 5.5 <noreply@anthropic.com>
Claude-Session: https://claude.ai/code/session_01FpAeMd8RZSyQpWh3R9Tigo
</commit_message>
<xml_diff>
--- a/md/COMMANDS.docx
+++ b/md/COMMANDS.docx
@@ -1435,6 +1435,24 @@
     </w:p>
     <w:p>
       <w:r>
+        <w:rPr>
+          <w:b/>
+        </w:rPr>
+        <w:t xml:space="preserve">JOBS  -  Freelance Jobs near you (ISK per unit, method, jumps) from the downloaded list</w:t>
+      </w:r>
+    </w:p>
+    <w:p>
+      <w:r>
+        <w:t xml:space="preserve">   example: python -m eve_profit jobs</w:t>
+      </w:r>
+    </w:p>
+    <w:p>
+      <w:r>
+        <w:t xml:space="preserve"/>
+      </w:r>
+    </w:p>
+    <w:p>
+      <w:r>
         <w:t xml:space="preserve">Scripts: python scripts/agent_steps.py [next|list|done|skip|back|reset]  - Level 1 agent checklist.</w:t>
       </w:r>
     </w:p>

</xml_diff>

<commit_message>
fitstock: owned modules/charges/drones/ships with fitting numbers
Co-Authored-By: Claude Sonnet 5.5 <noreply@anthropic.com>
Claude-Session: https://claude.ai/code/session_01FpAeMd8RZSyQpWh3R9Tigo
</commit_message>
<xml_diff>
--- a/md/COMMANDS.docx
+++ b/md/COMMANDS.docx
@@ -1453,6 +1453,24 @@
     </w:p>
     <w:p>
       <w:r>
+        <w:rPr>
+          <w:b/>
+        </w:rPr>
+        <w:t xml:space="preserve">FITSTOCK  -  modules, charges, drones and ships you own with slot and fighting numbers (to improve a fit)</w:t>
+      </w:r>
+    </w:p>
+    <w:p>
+      <w:r>
+        <w:t xml:space="preserve">   example: python -m eve_profit fitstock</w:t>
+      </w:r>
+    </w:p>
+    <w:p>
+      <w:r>
+        <w:t xml:space="preserve"/>
+      </w:r>
+    </w:p>
+    <w:p>
+      <w:r>
         <w:t xml:space="preserve">Scripts: python scripts/agent_steps.py [next|list|done|skip|back|reset]  - Level 1 agent checklist.</w:t>
       </w:r>
     </w:p>

</xml_diff>

<commit_message>
stopsync: stop then sync in one command
Co-Authored-By: Claude Sonnet 5.5 <noreply@anthropic.com>
Claude-Session: https://claude.ai/code/session_01FpAeMd8RZSyQpWh3R9Tigo
</commit_message>
<xml_diff>
--- a/md/COMMANDS.docx
+++ b/md/COMMANDS.docx
@@ -1471,6 +1471,24 @@
     </w:p>
     <w:p>
       <w:r>
+        <w:rPr>
+          <w:b/>
+        </w:rPr>
+        <w:t xml:space="preserve">STOPSYNC  -  stop the timer, then sync with the game (both, in the right order)</w:t>
+      </w:r>
+    </w:p>
+    <w:p>
+      <w:r>
+        <w:t xml:space="preserve">   example: python -m eve_profit stopsync</w:t>
+      </w:r>
+    </w:p>
+    <w:p>
+      <w:r>
+        <w:t xml:space="preserve"/>
+      </w:r>
+    </w:p>
+    <w:p>
+      <w:r>
         <w:t xml:space="preserve">Scripts: python scripts/agent_steps.py [next|list|done|skip|back|reset]  - Level 1 agent checklist.</w:t>
       </w:r>
     </w:p>

</xml_diff>

<commit_message>
syncstop is an alias of stopsync
Co-Authored-By: Claude Sonnet 5.5 <noreply@anthropic.com>
Claude-Session: https://claude.ai/code/session_01FpAeMd8RZSyQpWh3R9Tigo
</commit_message>
<xml_diff>
--- a/md/COMMANDS.docx
+++ b/md/COMMANDS.docx
@@ -1489,6 +1489,24 @@
     </w:p>
     <w:p>
       <w:r>
+        <w:rPr>
+          <w:b/>
+        </w:rPr>
+        <w:t xml:space="preserve">SYNCSTOP  -  same as stopsync (stop first, then sync)</w:t>
+      </w:r>
+    </w:p>
+    <w:p>
+      <w:r>
+        <w:t xml:space="preserve">   example: python -m eve_profit syncstop</w:t>
+      </w:r>
+    </w:p>
+    <w:p>
+      <w:r>
+        <w:t xml:space="preserve"/>
+      </w:r>
+    </w:p>
+    <w:p>
+      <w:r>
         <w:t xml:space="preserve">Scripts: python scripts/agent_steps.py [next|list|done|skip|back|reset]  - Level 1 agent checklist.</w:t>
       </w:r>
     </w:p>

</xml_diff>

<commit_message>
Refresh generated command lists
Co-Authored-By: Claude Sonnet 5.5 <noreply@anthropic.com>
Claude-Session: https://claude.ai/code/session_01FpAeMd8RZSyQpWh3R9Tigo
</commit_message>
<xml_diff>
--- a/md/COMMANDS.docx
+++ b/md/COMMANDS.docx
@@ -736,7 +736,7 @@
     </w:p>
     <w:p>
       <w:r>
-        <w:t xml:space="preserve">   --item         bestprice: item name or type id</w:t>
+        <w:t xml:space="preserve">   --item         bestprice: item name or type id; ships: filter by ship name or class</w:t>
       </w:r>
     </w:p>
     <w:p>
@@ -1230,7 +1230,7 @@
     </w:p>
     <w:p>
       <w:r>
-        <w:t xml:space="preserve">   --item         bestprice: item name or type id</w:t>
+        <w:t xml:space="preserve">   --item         bestprice: item name or type id; ships: filter by ship name or class</w:t>
       </w:r>
     </w:p>
     <w:p>
@@ -1462,6 +1462,24 @@
     <w:p>
       <w:r>
         <w:t xml:space="preserve">   example: python -m eve_profit fitstock</w:t>
+      </w:r>
+    </w:p>
+    <w:p>
+      <w:r>
+        <w:t xml:space="preserve"/>
+      </w:r>
+    </w:p>
+    <w:p>
+      <w:r>
+        <w:rPr>
+          <w:b/>
+        </w:rPr>
+        <w:t xml:space="preserve">SHIPS  -  the ship tree as a table: class, slots, skills to fly, price, how many tools it carries at once (--refresh reads new ships, --item filters)</w:t>
+      </w:r>
+    </w:p>
+    <w:p>
+      <w:r>
+        <w:t xml:space="preserve">   example: python -m eve_profit ships --item Frigate</w:t>
       </w:r>
     </w:p>
     <w:p>

</xml_diff>

<commit_message>
Agent reads only for agents the character can see; noagents command
Co-Authored-By: Claude Sonnet 5.5 <noreply@anthropic.com>
Claude-Session: https://claude.ai/code/session_01FpAeMd8RZSyQpWh3R9Tigo
</commit_message>
<xml_diff>
--- a/md/COMMANDS.docx
+++ b/md/COMMANDS.docx
@@ -1492,6 +1492,24 @@
         <w:rPr>
           <w:b/>
         </w:rPr>
+        <w:t xml:space="preserve">NOAGENTS  -  hide the agents you cannot see in the game (docked station, or --item NAME) so they are never planned</w:t>
+      </w:r>
+    </w:p>
+    <w:p>
+      <w:r>
+        <w:t xml:space="preserve">   example: python -m eve_profit noagents</w:t>
+      </w:r>
+    </w:p>
+    <w:p>
+      <w:r>
+        <w:t xml:space="preserve"/>
+      </w:r>
+    </w:p>
+    <w:p>
+      <w:r>
+        <w:rPr>
+          <w:b/>
+        </w:rPr>
         <w:t xml:space="preserve">STOPSYNC  -  stop the timer, then sync with the game (both, in the right order)</w:t>
       </w:r>
     </w:p>

</xml_diff>

<commit_message>
Health: record swallowed errors, show them in next and the health command
Co-Authored-By: Claude Sonnet 5.5 <noreply@anthropic.com>
Claude-Session: https://claude.ai/code/session_01FpAeMd8RZSyQpWh3R9Tigo
</commit_message>
<xml_diff>
--- a/md/COMMANDS.docx
+++ b/md/COMMANDS.docx
@@ -1510,6 +1510,24 @@
         <w:rPr>
           <w:b/>
         </w:rPr>
+        <w:t xml:space="preserve">HEALTH  -  problems hidden inside steps or the hourly log in the last 24 hours (so a bug shows without running things by hand)</w:t>
+      </w:r>
+    </w:p>
+    <w:p>
+      <w:r>
+        <w:t xml:space="preserve">   example: python -m eve_profit health</w:t>
+      </w:r>
+    </w:p>
+    <w:p>
+      <w:r>
+        <w:t xml:space="preserve"/>
+      </w:r>
+    </w:p>
+    <w:p>
+      <w:r>
+        <w:rPr>
+          <w:b/>
+        </w:rPr>
         <w:t xml:space="preserve">STOPSYNC  -  stop the timer, then sync with the game (both, in the right order)</w:t>
       </w:r>
     </w:p>

</xml_diff>

<commit_message>
preptree: blocked goals ranked with their cheapest prep chain (buy / build with bought blueprint + batch sell / mine+refine), first step joins next
Co-Authored-By: Claude Opus 5.5 <noreply@anthropic.com>
</commit_message>
<xml_diff>
--- a/md/COMMANDS.docx
+++ b/md/COMMANDS.docx
@@ -1561,6 +1561,24 @@
     </w:p>
     <w:p>
       <w:r>
+        <w:rPr>
+          <w:b/>
+        </w:rPr>
+        <w:t xml:space="preserve">PREPTREE  -  (no description yet)</w:t>
+      </w:r>
+    </w:p>
+    <w:p>
+      <w:r>
+        <w:t xml:space="preserve">   example: python -m eve_profit preptree</w:t>
+      </w:r>
+    </w:p>
+    <w:p>
+      <w:r>
+        <w:t xml:space="preserve"/>
+      </w:r>
+    </w:p>
+    <w:p>
+      <w:r>
         <w:t xml:space="preserve">Scripts: python scripts/agent_steps.py [next|list|done|skip|back|reset]  - Level 1 agent checklist.</w:t>
       </w:r>
     </w:p>

</xml_diff>

<commit_message>
combatcheck: fit DPS/EHP/repair vs mission levels 1-4 and ratting by the 99% rule; cheapest passing fit from combat_modules.json; combat readiness and prep chains per level
Co-Authored-By: Claude Opus 5.5 <noreply@anthropic.com>
</commit_message>
<xml_diff>
--- a/md/COMMANDS.docx
+++ b/md/COMMANDS.docx
@@ -1579,6 +1579,24 @@
     </w:p>
     <w:p>
       <w:r>
+        <w:rPr>
+          <w:b/>
+        </w:rPr>
+        <w:t xml:space="preserve">COMBATCHECK  -  your fit vs mission levels 1-4 and ratting by the 99% rule; the cheapest fit that passes</w:t>
+      </w:r>
+    </w:p>
+    <w:p>
+      <w:r>
+        <w:t xml:space="preserve">   example: python -m eve_profit combatcheck</w:t>
+      </w:r>
+    </w:p>
+    <w:p>
+      <w:r>
+        <w:t xml:space="preserve"/>
+      </w:r>
+    </w:p>
+    <w:p>
+      <w:r>
         <w:t xml:space="preserve">Scripts: python scripts/agent_steps.py [next|list|done|skip|back|reset]  - Level 1 agent checklist.</w:t>
       </w:r>
     </w:p>

</xml_diff>

<commit_message>
Killboard fit database for every hull (fitdb, fits command, daily grab); fit picker uses only modules you can fit
Co-Authored-By: Claude Opus 5.5 <noreply@anthropic.com>
</commit_message>
<xml_diff>
--- a/md/COMMANDS.docx
+++ b/md/COMMANDS.docx
@@ -1597,6 +1597,24 @@
     </w:p>
     <w:p>
       <w:r>
+        <w:rPr>
+          <w:b/>
+        </w:rPr>
+        <w:t xml:space="preserve">FITS  -  killboard fits for a hull (default: yours): fits that rarely die to NPCs, modules to avoid, what it wins with (--item HULL)</w:t>
+      </w:r>
+    </w:p>
+    <w:p>
+      <w:r>
+        <w:t xml:space="preserve">   example: python -m eve_profit fits --item Catalyst</w:t>
+      </w:r>
+    </w:p>
+    <w:p>
+      <w:r>
+        <w:t xml:space="preserve"/>
+      </w:r>
+    </w:p>
+    <w:p>
+      <w:r>
         <w:t xml:space="preserve">Scripts: python scripts/agent_steps.py [next|list|done|skip|back|reset]  - Level 1 agent checklist.</w:t>
       </w:r>
     </w:p>

</xml_diff>